<commit_message>
docs(cadrage): CJM - correction profil Mme Lefevre (42 ans, BTS Comm, Lyon, 28 eleves, 5 etapes)
</commit_message>
<xml_diff>
--- a/docs/cadrage/03_customer_journey_map.docx
+++ b/docs/cadrage/03_customer_journey_map.docx
@@ -5719,7 +5719,7 @@
                 <w:sz w:val="21"/>
                 <w:szCs w:val="21"/>
               </w:rPr>
-              <w:t xml:space="preserve">47 ans, Maître de conférences en Sciences de l'Éducation, IUT de Créteil. Prépare ses évaluations manuellement (3h pour 10 questions).</w:t>
+              <w:t xml:space="preserve">42 ans, Enseignante en BTS Communication, Lyon. Responsable d'une classe de 28 élèves. Prépare ses évaluations manuellement (3h pour 10 questions).</w:t>
             </w:r>
           </w:p>
           <w:p>
@@ -5732,7 +5732,7 @@
                 <w:sz w:val="21"/>
                 <w:szCs w:val="21"/>
               </w:rPr>
-              <w:t xml:space="preserve">Exige que les données de ses étudiants et de son manuel restent dans l'établissement.</w:t>
+              <w:t xml:space="preserve">Besoin principal : suivre la progression de sa classe et repérer les élèves décrocheurs. Exige que les données de ses élèves restent dans l'établissement.</w:t>
             </w:r>
           </w:p>
         </w:tc>
@@ -6390,6 +6390,132 @@
                 <w:szCs w:val="19"/>
               </w:rPr>
               <w:t xml:space="preserve">Pas d'export Word/PDF dans le MVP · Pas de gestion de cohorte</w:t>
+            </w:r>
+          </w:p>
+        </w:tc>
+      </w:tr>
+      <w:tr>
+        <w:tc>
+          <w:tcPr>
+            <w:tcW w:type="dxa" w:w="1800"/>
+            <w:tcBorders>
+              <w:top w:val="single" w:color="BFBFBF" w:sz="4"/>
+              <w:left w:val="single" w:color="BFBFBF" w:sz="4"/>
+              <w:bottom w:val="single" w:color="BFBFBF" w:sz="4"/>
+              <w:right w:val="single" w:color="BFBFBF" w:sz="4"/>
+            </w:tcBorders>
+            <w:shd w:fill="FFFFFF" w:val="clear"/>
+            <w:tcMar>
+              <w:top w:type="dxa" w:w="70"/>
+              <w:left w:type="dxa" w:w="100"/>
+              <w:bottom w:type="dxa" w:w="70"/>
+              <w:right w:type="dxa" w:w="100"/>
+            </w:tcMar>
+            <w:vAlign w:val="top"/>
+          </w:tcPr>
+          <w:p>
+            <w:pPr>
+              <w:spacing w:after="0"/>
+            </w:pPr>
+            <w:r>
+              <w:rPr>
+                <w:sz w:val="19"/>
+                <w:szCs w:val="19"/>
+              </w:rPr>
+              <w:t xml:space="preserve">Satisfaction / Recommandation</w:t>
+            </w:r>
+          </w:p>
+        </w:tc>
+        <w:tc>
+          <w:tcPr>
+            <w:tcW w:type="dxa" w:w="4200"/>
+            <w:tcBorders>
+              <w:top w:val="single" w:color="BFBFBF" w:sz="4"/>
+              <w:left w:val="single" w:color="BFBFBF" w:sz="4"/>
+              <w:bottom w:val="single" w:color="BFBFBF" w:sz="4"/>
+              <w:right w:val="single" w:color="BFBFBF" w:sz="4"/>
+            </w:tcBorders>
+            <w:shd w:fill="FFFFFF" w:val="clear"/>
+            <w:tcMar>
+              <w:top w:type="dxa" w:w="70"/>
+              <w:left w:type="dxa" w:w="100"/>
+              <w:bottom w:type="dxa" w:w="70"/>
+              <w:right w:type="dxa" w:w="100"/>
+            </w:tcMar>
+            <w:vAlign w:val="top"/>
+          </w:tcPr>
+          <w:p>
+            <w:pPr>
+              <w:spacing w:after="0"/>
+            </w:pPr>
+            <w:r>
+              <w:rPr>
+                <w:sz w:val="19"/>
+                <w:szCs w:val="19"/>
+              </w:rPr>
+              <w:t xml:space="preserve">Si la qualité est jugée bonne : recommande EduTutor IA à ses collègues de département · Continue à générer ses QCM avec l'outil. Si la qualité est insuffisante : abandonne l'outil · Revient à la préparation manuelle de ses évaluations</w:t>
+            </w:r>
+          </w:p>
+        </w:tc>
+        <w:tc>
+          <w:tcPr>
+            <w:tcW w:type="dxa" w:w="3600"/>
+            <w:tcBorders>
+              <w:top w:val="single" w:color="BFBFBF" w:sz="4"/>
+              <w:left w:val="single" w:color="BFBFBF" w:sz="4"/>
+              <w:bottom w:val="single" w:color="BFBFBF" w:sz="4"/>
+              <w:right w:val="single" w:color="BFBFBF" w:sz="4"/>
+            </w:tcBorders>
+            <w:shd w:fill="FFFFFF" w:val="clear"/>
+            <w:tcMar>
+              <w:top w:type="dxa" w:w="70"/>
+              <w:left w:type="dxa" w:w="100"/>
+              <w:bottom w:type="dxa" w:w="70"/>
+              <w:right w:type="dxa" w:w="100"/>
+            </w:tcMar>
+            <w:vAlign w:val="top"/>
+          </w:tcPr>
+          <w:p>
+            <w:pPr>
+              <w:spacing w:after="0"/>
+            </w:pPr>
+            <w:r>
+              <w:rPr>
+                <w:sz w:val="19"/>
+                <w:szCs w:val="19"/>
+              </w:rPr>
+              <w:t xml:space="preserve">Fierté et gain de crédibilité auprès de ses collègues si l'outil tient ses promesses · Déception et méfiance renforcée si la qualité reste insuffisante</w:t>
+            </w:r>
+          </w:p>
+        </w:tc>
+        <w:tc>
+          <w:tcPr>
+            <w:tcW w:type="dxa" w:w="4080"/>
+            <w:tcBorders>
+              <w:top w:val="single" w:color="BFBFBF" w:sz="4"/>
+              <w:left w:val="single" w:color="BFBFBF" w:sz="4"/>
+              <w:bottom w:val="single" w:color="BFBFBF" w:sz="4"/>
+              <w:right w:val="single" w:color="BFBFBF" w:sz="4"/>
+            </w:tcBorders>
+            <w:shd w:fill="FFFFFF" w:val="clear"/>
+            <w:tcMar>
+              <w:top w:type="dxa" w:w="70"/>
+              <w:left w:type="dxa" w:w="100"/>
+              <w:bottom w:type="dxa" w:w="70"/>
+              <w:right w:type="dxa" w:w="100"/>
+            </w:tcMar>
+            <w:vAlign w:val="top"/>
+          </w:tcPr>
+          <w:p>
+            <w:pPr>
+              <w:spacing w:after="0"/>
+            </w:pPr>
+            <w:r>
+              <w:rPr>
+                <w:sz w:val="19"/>
+                <w:szCs w:val="19"/>
+              </w:rPr>
+              <w:t xml:space="preserve">Pas de mécanisme de retour structuré pour mesurer la satisfaction enseignant · Pas de canal de recommandation entre collègues intégré au produit</w:t>
             </w:r>
           </w:p>
         </w:tc>

</xml_diff>